<commit_message>
Anzahl Objekte je Schwierigkeit angepasst
</commit_message>
<xml_diff>
--- a/wild-jam-april-2026/__ORGA/Offene Todos.docx
+++ b/wild-jam-april-2026/__ORGA/Offene Todos.docx
@@ -328,8 +328,16 @@
         <w:rPr>
           <w:lang w:val="en-US"/>
         </w:rPr>
-        <w:t>Banane in hand ?</w:t>
-      </w:r>
+        <w:t xml:space="preserve">Banane in </w:t>
+      </w:r>
+      <w:proofErr w:type="gramStart"/>
+      <w:r>
+        <w:rPr>
+          <w:lang w:val="en-US"/>
+        </w:rPr>
+        <w:t>hand ?</w:t>
+      </w:r>
+      <w:proofErr w:type="gramEnd"/>
     </w:p>
     <w:p>
       <w:pPr>
@@ -470,10 +478,6 @@
     <w:p>
       <w:pPr>
         <w:pStyle w:val="Listenabsatz"/>
-        <w:numPr>
-          <w:ilvl w:val="0"/>
-          <w:numId w:val="1"/>
-        </w:numPr>
         <w:rPr>
           <w:lang w:val="en-US"/>
         </w:rPr>
@@ -645,6 +649,7 @@
         <w:t xml:space="preserve">Mehr </w:t>
       </w:r>
       <w:proofErr w:type="spellStart"/>
+      <w:proofErr w:type="gramStart"/>
       <w:r>
         <w:rPr>
           <w:lang w:val="en-US"/>
@@ -656,7 +661,14 @@
         <w:rPr>
           <w:lang w:val="en-US"/>
         </w:rPr>
-        <w:t xml:space="preserve"> ? </w:t>
+        <w:t xml:space="preserve"> ?</w:t>
+      </w:r>
+      <w:proofErr w:type="gramEnd"/>
+      <w:r>
+        <w:rPr>
+          <w:lang w:val="en-US"/>
+        </w:rPr>
+        <w:t xml:space="preserve"> </w:t>
       </w:r>
     </w:p>
     <w:p>
@@ -1034,7 +1046,21 @@
         <w:rPr>
           <w:lang w:val="en-US"/>
         </w:rPr>
-        <w:t xml:space="preserve"> (more forgiving interact Area)</w:t>
+        <w:t xml:space="preserve"> (more forgiving </w:t>
+      </w:r>
+      <w:proofErr w:type="gramStart"/>
+      <w:r>
+        <w:rPr>
+          <w:lang w:val="en-US"/>
+        </w:rPr>
+        <w:t>interact</w:t>
+      </w:r>
+      <w:proofErr w:type="gramEnd"/>
+      <w:r>
+        <w:rPr>
+          <w:lang w:val="en-US"/>
+        </w:rPr>
+        <w:t xml:space="preserve"> Area)</w:t>
       </w:r>
     </w:p>
     <w:sectPr>
@@ -1771,6 +1797,7 @@
   <w:style w:type="character" w:default="1" w:styleId="Absatz-Standardschriftart">
     <w:name w:val="Default Paragraph Font"/>
     <w:uiPriority w:val="1"/>
+    <w:semiHidden/>
     <w:unhideWhenUsed/>
   </w:style>
   <w:style w:type="table" w:default="1" w:styleId="NormaleTabelle">

</xml_diff>